<commit_message>
CLARK syllabi: footer licence CC BY-NC-SA 4.0
</commit_message>
<xml_diff>
--- a/files/clark-syllabus-incident-response-fundamentals-8.docx
+++ b/files/clark-syllabus-incident-response-fundamentals-8.docx
@@ -464,7 +464,7 @@
         </w:rPr>
         <w:t xml:space="preserve">NIST. </w:t>
       </w:r>
-      <w:hyperlink w:history="1" r:id="rIdwzc79t8k_l9fs25kv_olq">
+      <w:hyperlink w:history="1" r:id="rIdedgfowiwhhnxhzdnjztia">
         <w:r>
           <w:rPr>
             <w:rFonts w:ascii="Verdana" w:cs="Verdana" w:eastAsia="Verdana" w:hAnsi="Verdana"/>
@@ -512,7 +512,7 @@
         </w:rPr>
         <w:t xml:space="preserve">MITRE. </w:t>
       </w:r>
-      <w:hyperlink w:history="1" r:id="rIdffj_ug3rnjflfzspb3neb">
+      <w:hyperlink w:history="1" r:id="rIdt4oexqdqeew_tcdlwq0ee">
         <w:r>
           <w:rPr>
             <w:rFonts w:ascii="Verdana" w:cs="Verdana" w:eastAsia="Verdana" w:hAnsi="Verdana"/>
@@ -560,7 +560,7 @@
         </w:rPr>
         <w:t xml:space="preserve">CISA. </w:t>
       </w:r>
-      <w:hyperlink w:history="1" r:id="rIdhi47j7ilqurdqvev078wx">
+      <w:hyperlink w:history="1" r:id="rId4xqev5kbccebj0_pdzn3q">
         <w:r>
           <w:rPr>
             <w:rFonts w:ascii="Verdana" w:cs="Verdana" w:eastAsia="Verdana" w:hAnsi="Verdana"/>
@@ -608,7 +608,7 @@
         </w:rPr>
         <w:t xml:space="preserve">NIST. </w:t>
       </w:r>
-      <w:hyperlink w:history="1" r:id="rIdptlm92yslkq8x_sfpiryq">
+      <w:hyperlink w:history="1" r:id="rIduussjvpccuphbjc9yiqao">
         <w:r>
           <w:rPr>
             <w:rFonts w:ascii="Verdana" w:cs="Verdana" w:eastAsia="Verdana" w:hAnsi="Verdana"/>
@@ -656,7 +656,7 @@
         </w:rPr>
         <w:t xml:space="preserve">CISA and partners. </w:t>
       </w:r>
-      <w:hyperlink w:history="1" r:id="rId3gzvbkxamvpcoioe_vyuc">
+      <w:hyperlink w:history="1" r:id="rId25y2-fc-rduw_d9vl9icd">
         <w:r>
           <w:rPr>
             <w:rFonts w:ascii="Verdana" w:cs="Verdana" w:eastAsia="Verdana" w:hAnsi="Verdana"/>
@@ -704,7 +704,7 @@
         </w:rPr>
         <w:t xml:space="preserve">Microsoft Learn. </w:t>
       </w:r>
-      <w:hyperlink w:history="1" r:id="rIdy0o8hnkwk8ncqjeetwqqg">
+      <w:hyperlink w:history="1" r:id="rIdyog3ycbyjq9s-gh0h7dd6">
         <w:r>
           <w:rPr>
             <w:rFonts w:ascii="Verdana" w:cs="Verdana" w:eastAsia="Verdana" w:hAnsi="Verdana"/>
@@ -752,7 +752,7 @@
         </w:rPr>
         <w:t xml:space="preserve">Microsoft Learn (Defender for Office 365). </w:t>
       </w:r>
-      <w:hyperlink w:history="1" r:id="rIdkxwvokuf34fwtfnepd161">
+      <w:hyperlink w:history="1" r:id="rIdc63go2_8d-5r2atdtmzh1">
         <w:r>
           <w:rPr>
             <w:rFonts w:ascii="Verdana" w:cs="Verdana" w:eastAsia="Verdana" w:hAnsi="Verdana"/>
@@ -800,7 +800,7 @@
         </w:rPr>
         <w:t xml:space="preserve">Wireshark Foundation. </w:t>
       </w:r>
-      <w:hyperlink w:history="1" r:id="rIdrqagaqgb-vhoxuvhio1pn">
+      <w:hyperlink w:history="1" r:id="rIdqicm1pu9jf0myaireet1_">
         <w:r>
           <w:rPr>
             <w:rFonts w:ascii="Verdana" w:cs="Verdana" w:eastAsia="Verdana" w:hAnsi="Verdana"/>
@@ -848,7 +848,7 @@
         </w:rPr>
         <w:t xml:space="preserve">ENISA. </w:t>
       </w:r>
-      <w:hyperlink w:history="1" r:id="rIdgrstip7pencu35ehwxond">
+      <w:hyperlink w:history="1" r:id="rIdfjvaunk7wyzaoi95tiwli">
         <w:r>
           <w:rPr>
             <w:rFonts w:ascii="Verdana" w:cs="Verdana" w:eastAsia="Verdana" w:hAnsi="Verdana"/>
@@ -5148,7 +5148,7 @@
         <w:sz w:val="16"/>
         <w:szCs w:val="16"/>
       </w:rPr>
-      <w:t xml:space="preserve">This document is licensed with a Creative Commons Attribution 4.0 International License ©2026 The Competence Collective, LLC (Red Herrings)</w:t>
+      <w:t xml:space="preserve">This document is licensed with a Creative Commons Attribution-NonCommercial-ShareAlike 4.0 International License ©2026 The Competence Collective, LLC (Red Herrings)</w:t>
     </w:r>
   </w:p>
 </w:ftr>

</xml_diff>

<commit_message>
Site-hosted syllabus docx: CC BY 4.0 footer
</commit_message>
<xml_diff>
--- a/files/clark-syllabus-incident-response-fundamentals-8.docx
+++ b/files/clark-syllabus-incident-response-fundamentals-8.docx
@@ -464,7 +464,7 @@
         </w:rPr>
         <w:t xml:space="preserve">NIST. </w:t>
       </w:r>
-      <w:hyperlink w:history="1" r:id="rIdedgfowiwhhnxhzdnjztia">
+      <w:hyperlink w:history="1" r:id="rIddyiu0uxlrnwjgjmkqgh95">
         <w:r>
           <w:rPr>
             <w:rFonts w:ascii="Verdana" w:cs="Verdana" w:eastAsia="Verdana" w:hAnsi="Verdana"/>
@@ -512,7 +512,7 @@
         </w:rPr>
         <w:t xml:space="preserve">MITRE. </w:t>
       </w:r>
-      <w:hyperlink w:history="1" r:id="rIdt4oexqdqeew_tcdlwq0ee">
+      <w:hyperlink w:history="1" r:id="rIdzr_-s3fqsi5zzj-ccf0jj">
         <w:r>
           <w:rPr>
             <w:rFonts w:ascii="Verdana" w:cs="Verdana" w:eastAsia="Verdana" w:hAnsi="Verdana"/>
@@ -560,7 +560,7 @@
         </w:rPr>
         <w:t xml:space="preserve">CISA. </w:t>
       </w:r>
-      <w:hyperlink w:history="1" r:id="rId4xqev5kbccebj0_pdzn3q">
+      <w:hyperlink w:history="1" r:id="rId1behpohntgklnnfsn77nb">
         <w:r>
           <w:rPr>
             <w:rFonts w:ascii="Verdana" w:cs="Verdana" w:eastAsia="Verdana" w:hAnsi="Verdana"/>
@@ -608,7 +608,7 @@
         </w:rPr>
         <w:t xml:space="preserve">NIST. </w:t>
       </w:r>
-      <w:hyperlink w:history="1" r:id="rIduussjvpccuphbjc9yiqao">
+      <w:hyperlink w:history="1" r:id="rIdtbatcypymtgmcpix3erld">
         <w:r>
           <w:rPr>
             <w:rFonts w:ascii="Verdana" w:cs="Verdana" w:eastAsia="Verdana" w:hAnsi="Verdana"/>
@@ -656,7 +656,7 @@
         </w:rPr>
         <w:t xml:space="preserve">CISA and partners. </w:t>
       </w:r>
-      <w:hyperlink w:history="1" r:id="rId25y2-fc-rduw_d9vl9icd">
+      <w:hyperlink w:history="1" r:id="rIdlg_0quwgxibucoudmuhtt">
         <w:r>
           <w:rPr>
             <w:rFonts w:ascii="Verdana" w:cs="Verdana" w:eastAsia="Verdana" w:hAnsi="Verdana"/>
@@ -704,7 +704,7 @@
         </w:rPr>
         <w:t xml:space="preserve">Microsoft Learn. </w:t>
       </w:r>
-      <w:hyperlink w:history="1" r:id="rIdyog3ycbyjq9s-gh0h7dd6">
+      <w:hyperlink w:history="1" r:id="rIdndklduthwq6lobk9ctq6m">
         <w:r>
           <w:rPr>
             <w:rFonts w:ascii="Verdana" w:cs="Verdana" w:eastAsia="Verdana" w:hAnsi="Verdana"/>
@@ -752,7 +752,7 @@
         </w:rPr>
         <w:t xml:space="preserve">Microsoft Learn (Defender for Office 365). </w:t>
       </w:r>
-      <w:hyperlink w:history="1" r:id="rIdc63go2_8d-5r2atdtmzh1">
+      <w:hyperlink w:history="1" r:id="rIdenzzvfw-awox8t1nzh3hi">
         <w:r>
           <w:rPr>
             <w:rFonts w:ascii="Verdana" w:cs="Verdana" w:eastAsia="Verdana" w:hAnsi="Verdana"/>
@@ -800,7 +800,7 @@
         </w:rPr>
         <w:t xml:space="preserve">Wireshark Foundation. </w:t>
       </w:r>
-      <w:hyperlink w:history="1" r:id="rIdqicm1pu9jf0myaireet1_">
+      <w:hyperlink w:history="1" r:id="rId4zxjh4fdiwew4j8a2u1ea">
         <w:r>
           <w:rPr>
             <w:rFonts w:ascii="Verdana" w:cs="Verdana" w:eastAsia="Verdana" w:hAnsi="Verdana"/>
@@ -848,7 +848,7 @@
         </w:rPr>
         <w:t xml:space="preserve">ENISA. </w:t>
       </w:r>
-      <w:hyperlink w:history="1" r:id="rIdfjvaunk7wyzaoi95tiwli">
+      <w:hyperlink w:history="1" r:id="rIdnvyjor7imcsqiqqbt4nec">
         <w:r>
           <w:rPr>
             <w:rFonts w:ascii="Verdana" w:cs="Verdana" w:eastAsia="Verdana" w:hAnsi="Verdana"/>
@@ -5148,7 +5148,7 @@
         <w:sz w:val="16"/>
         <w:szCs w:val="16"/>
       </w:rPr>
-      <w:t xml:space="preserve">This document is licensed with a Creative Commons Attribution-NonCommercial-ShareAlike 4.0 International License ©2026 The Competence Collective, LLC (Red Herrings)</w:t>
+      <w:t xml:space="preserve">This document is licensed with a Creative Commons Attribution 4.0 International License ©2026 The Competence Collective, LLC (Red Herrings)</w:t>
     </w:r>
   </w:p>
 </w:ftr>

</xml_diff>